<commit_message>
Atualização AlfaPeople, AZ900, AI900
</commit_message>
<xml_diff>
--- a/Elton Fonseca de Mattos (br).docx
+++ b/Elton Fonseca de Mattos (br).docx
@@ -338,6 +338,7 @@
         </w:rPr>
         <w:t xml:space="preserve"> </w:t>
       </w:r>
+      <w:proofErr w:type="spellStart"/>
       <w:r>
         <w:rPr>
           <w:sz w:val="16"/>
@@ -346,6 +347,7 @@
         </w:rPr>
         <w:t>elton-mattos</w:t>
       </w:r>
+      <w:proofErr w:type="spellEnd"/>
     </w:p>
     <w:p>
       <w:pPr>
@@ -905,7 +907,43 @@
           <w:szCs w:val="20"/>
           <w:lang w:val="en-US"/>
         </w:rPr>
-        <w:t xml:space="preserve"> Profissional certificado </w:t>
+        <w:t xml:space="preserve"> </w:t>
+      </w:r>
+      <w:proofErr w:type="spellStart"/>
+      <w:r>
+        <w:rPr>
+          <w:rFonts w:cs="Calibri (Body)"/>
+          <w:szCs w:val="20"/>
+          <w:lang w:val="en-US"/>
+        </w:rPr>
+        <w:t>Profissional</w:t>
+      </w:r>
+      <w:proofErr w:type="spellEnd"/>
+      <w:r>
+        <w:rPr>
+          <w:rFonts w:cs="Calibri (Body)"/>
+          <w:szCs w:val="20"/>
+          <w:lang w:val="en-US"/>
+        </w:rPr>
+        <w:t> </w:t>
+      </w:r>
+      <w:proofErr w:type="spellStart"/>
+      <w:r>
+        <w:rPr>
+          <w:rFonts w:cs="Calibri (Body)"/>
+          <w:szCs w:val="20"/>
+          <w:lang w:val="en-US"/>
+        </w:rPr>
+        <w:t>certificado</w:t>
+      </w:r>
+      <w:proofErr w:type="spellEnd"/>
+      <w:r>
+        <w:rPr>
+          <w:rFonts w:cs="Calibri (Body)"/>
+          <w:szCs w:val="20"/>
+          <w:lang w:val="en-US"/>
+        </w:rPr>
+        <w:t> </w:t>
       </w:r>
       <w:r>
         <w:rPr>
@@ -947,9 +985,23 @@
           <w:numId w:val="4"/>
         </w:numPr>
         <w:ind w:left="426"/>
-      </w:pPr>
-      <w:r>
-        <w:t>Software Engineer</w:t>
+        <w:rPr>
+          <w:rFonts w:ascii="Segoe UI" w:eastAsiaTheme="minorEastAsia" w:hAnsi="Segoe UI" w:cstheme="minorBidi"/>
+          <w:szCs w:val="22"/>
+          <w:lang w:bidi="pt-BR"/>
+        </w:rPr>
+      </w:pPr>
+      <w:r>
+        <w:rPr>
+          <w:rStyle w:val="notion-enable-hover"/>
+        </w:rPr>
+        <w:t xml:space="preserve">Desenvolvedor Dynamics </w:t>
+      </w:r>
+      <w:r>
+        <w:rPr>
+          <w:rStyle w:val="notion-enable-hover"/>
+        </w:rPr>
+        <w:t>365/Power Platform</w:t>
       </w:r>
     </w:p>
     <w:p>
@@ -960,12 +1012,24 @@
           <w:tab w:val="right" w:pos="10348"/>
         </w:tabs>
         <w:ind w:left="426" w:right="118"/>
-      </w:pPr>
-      <w:r>
-        <w:t>NTT Data | São Paulo, SP (</w:t>
-      </w:r>
-      <w:r>
-        <w:t>Remoto</w:t>
+        <w:rPr>
+          <w:lang w:bidi="pt-BR"/>
+        </w:rPr>
+      </w:pPr>
+      <w:r>
+        <w:t>AlfaPeople</w:t>
+      </w:r>
+      <w:r>
+        <w:rPr>
+          <w:lang w:bidi="pt-BR"/>
+        </w:rPr>
+        <w:t xml:space="preserve"> </w:t>
+      </w:r>
+      <w:r>
+        <w:t>| São Paulo, SP (Remot</w:t>
+      </w:r>
+      <w:r>
+        <w:t>o</w:t>
       </w:r>
       <w:r>
         <w:t>)</w:t>
@@ -977,70 +1041,16 @@
         <w:tab/>
       </w:r>
       <w:r>
-        <w:rPr>
-          <w:lang w:bidi="pt-BR"/>
-        </w:rPr>
-        <w:t xml:space="preserve">Jun/2022 </w:t>
-      </w:r>
-      <w:r>
-        <w:rPr>
-          <w:lang w:bidi="pt-BR"/>
-        </w:rPr>
-        <w:t>–</w:t>
-      </w:r>
-      <w:r>
-        <w:rPr>
-          <w:lang w:bidi="pt-BR"/>
-        </w:rPr>
-        <w:t xml:space="preserve"> </w:t>
-      </w:r>
-      <w:r>
-        <w:rPr>
-          <w:lang w:bidi="pt-BR"/>
-        </w:rPr>
-        <w:t>Jul/2024</w:t>
-      </w:r>
-    </w:p>
-    <w:p>
-      <w:pPr>
-        <w:pStyle w:val="ListParagraph"/>
-        <w:ind w:left="426" w:right="2386"/>
-      </w:pPr>
-      <w:r>
-        <w:t xml:space="preserve">Desenvolvimento e manutenção de extensões (Plugins, Custom Workflows, Scripts, Power Automate, Integrações) utilizando linguagens de programação C# e Javascript, customização de ambiente Dynamics </w:t>
-      </w:r>
-      <w:r>
-        <w:t>365</w:t>
-      </w:r>
-      <w:r>
-        <w:t>,</w:t>
-      </w:r>
-      <w:r>
-        <w:t xml:space="preserve"> Treinamento de turmas</w:t>
-      </w:r>
-      <w:r>
-        <w:t xml:space="preserve"> </w:t>
-      </w:r>
-      <w:r>
-        <w:t xml:space="preserve">para </w:t>
-      </w:r>
-      <w:r>
-        <w:t>d</w:t>
-      </w:r>
-      <w:r>
-        <w:t xml:space="preserve">esenvolvimento </w:t>
-      </w:r>
-      <w:r>
-        <w:t>de</w:t>
-      </w:r>
-      <w:r>
-        <w:t xml:space="preserve"> Extensões para o Dynamics</w:t>
-      </w:r>
-      <w:r>
-        <w:t xml:space="preserve"> 365/Dataverse</w:t>
-      </w:r>
-      <w:r>
-        <w:t>.</w:t>
+        <w:t>A</w:t>
+      </w:r>
+      <w:r>
+        <w:t>b</w:t>
+      </w:r>
+      <w:r>
+        <w:t>r/2025</w:t>
+      </w:r>
+      <w:r>
+        <w:t xml:space="preserve"> - Atualmente</w:t>
       </w:r>
     </w:p>
     <w:p>
@@ -1051,23 +1061,9 @@
           <w:numId w:val="4"/>
         </w:numPr>
         <w:ind w:left="426"/>
-        <w:rPr>
-          <w:rFonts w:ascii="Segoe UI" w:eastAsiaTheme="minorEastAsia" w:hAnsi="Segoe UI" w:cstheme="minorBidi"/>
-          <w:szCs w:val="22"/>
-          <w:lang w:bidi="pt-BR"/>
-        </w:rPr>
-      </w:pPr>
-      <w:r>
-        <w:rPr>
-          <w:rStyle w:val="notion-enable-hover"/>
-        </w:rPr>
-        <w:t xml:space="preserve">Analista Desenvolvedor Dynamics </w:t>
-      </w:r>
-      <w:r>
-        <w:rPr>
-          <w:rStyle w:val="notion-enable-hover"/>
-        </w:rPr>
-        <w:t>365/Power Platform</w:t>
+      </w:pPr>
+      <w:r>
+        <w:t>Software Engineer</w:t>
       </w:r>
     </w:p>
     <w:p>
@@ -1078,36 +1074,87 @@
           <w:tab w:val="right" w:pos="10348"/>
         </w:tabs>
         <w:ind w:left="426" w:right="118"/>
+      </w:pPr>
+      <w:r>
+        <w:t>NTT Data | São Paulo, SP (</w:t>
+      </w:r>
+      <w:r>
+        <w:t>Remoto</w:t>
+      </w:r>
+      <w:r>
+        <w:t>)</w:t>
+      </w:r>
+      <w:r>
         <w:rPr>
           <w:lang w:bidi="pt-BR"/>
         </w:rPr>
-      </w:pPr>
-      <w:r>
-        <w:t>Smart Consulting</w:t>
+        <w:tab/>
       </w:r>
       <w:r>
         <w:rPr>
           <w:lang w:bidi="pt-BR"/>
         </w:rPr>
+        <w:t xml:space="preserve">Jun/2022 </w:t>
+      </w:r>
+      <w:r>
+        <w:rPr>
+          <w:lang w:bidi="pt-BR"/>
+        </w:rPr>
+        <w:t>–</w:t>
+      </w:r>
+      <w:r>
+        <w:rPr>
+          <w:lang w:bidi="pt-BR"/>
+        </w:rPr>
         <w:t xml:space="preserve"> </w:t>
       </w:r>
       <w:r>
-        <w:t>| São Paulo, SP (</w:t>
-      </w:r>
-      <w:r>
-        <w:t>Remoto</w:t>
-      </w:r>
-      <w:r>
-        <w:t>)</w:t>
-      </w:r>
-      <w:r>
         <w:rPr>
           <w:lang w:bidi="pt-BR"/>
         </w:rPr>
-        <w:tab/>
-      </w:r>
-      <w:r>
-        <w:t>Mai/2021 - Jun/2022</w:t>
+        <w:t>Jul/2024</w:t>
+      </w:r>
+    </w:p>
+    <w:p>
+      <w:pPr>
+        <w:pStyle w:val="ListParagraph"/>
+        <w:ind w:left="426" w:right="2386"/>
+      </w:pPr>
+      <w:r>
+        <w:t xml:space="preserve">Desenvolvimento e manutenção de extensões (Plugins, Custom Workflows, Scripts, Power Automate, Integrações) utilizando linguagens de programação C# e Javascript, customização de ambiente Dynamics </w:t>
+      </w:r>
+      <w:r>
+        <w:t>365</w:t>
+      </w:r>
+      <w:r>
+        <w:t>,</w:t>
+      </w:r>
+      <w:r>
+        <w:t xml:space="preserve"> Treinamento de turmas</w:t>
+      </w:r>
+      <w:r>
+        <w:t xml:space="preserve"> </w:t>
+      </w:r>
+      <w:r>
+        <w:t xml:space="preserve">para </w:t>
+      </w:r>
+      <w:r>
+        <w:t>d</w:t>
+      </w:r>
+      <w:r>
+        <w:t xml:space="preserve">esenvolvimento </w:t>
+      </w:r>
+      <w:r>
+        <w:t>de</w:t>
+      </w:r>
+      <w:r>
+        <w:t xml:space="preserve"> Extensões para o Dynamics</w:t>
+      </w:r>
+      <w:r>
+        <w:t xml:space="preserve"> 365/Dataverse</w:t>
+      </w:r>
+      <w:r>
+        <w:t>.</w:t>
       </w:r>
     </w:p>
     <w:p>
@@ -1128,7 +1175,7 @@
         <w:rPr>
           <w:rStyle w:val="notion-enable-hover"/>
         </w:rPr>
-        <w:t xml:space="preserve">Desenvolvedor Dynamics </w:t>
+        <w:t xml:space="preserve">Analista Desenvolvedor Dynamics </w:t>
       </w:r>
       <w:r>
         <w:rPr>
@@ -1150,7 +1197,16 @@
         </w:rPr>
       </w:pPr>
       <w:r>
-        <w:t>Best.Projects | São Paulo, SP (</w:t>
+        <w:t>Smart Consulting</w:t>
+      </w:r>
+      <w:r>
+        <w:rPr>
+          <w:lang w:bidi="pt-BR"/>
+        </w:rPr>
+        <w:t xml:space="preserve"> </w:t>
+      </w:r>
+      <w:r>
+        <w:t>| São Paulo, SP (</w:t>
       </w:r>
       <w:r>
         <w:t>Remoto</w:t>
@@ -1165,13 +1221,7 @@
         <w:tab/>
       </w:r>
       <w:r>
-        <w:t xml:space="preserve">Jul/2020 </w:t>
-      </w:r>
-      <w:r>
-        <w:t>-</w:t>
-      </w:r>
-      <w:r>
-        <w:t xml:space="preserve"> Mai/2021</w:t>
+        <w:t>Mai/2021 - Jun/2022</w:t>
       </w:r>
     </w:p>
     <w:p>
@@ -1181,64 +1231,61 @@
           <w:ilvl w:val="0"/>
           <w:numId w:val="4"/>
         </w:numPr>
-        <w:tabs>
-          <w:tab w:val="right" w:pos="10348"/>
-        </w:tabs>
-        <w:ind w:left="426" w:right="118"/>
-      </w:pPr>
-      <w:r>
-        <w:rPr>
-          <w:rStyle w:val="notion-enable-hover"/>
-        </w:rPr>
-        <w:t xml:space="preserve">Analista Desenvolvedor Dynamics </w:t>
-      </w:r>
-      <w:r>
-        <w:rPr>
-          <w:rStyle w:val="notion-enable-hover"/>
-        </w:rPr>
-        <w:t>365/Power Platform</w:t>
-      </w:r>
-      <w:r>
-        <w:rPr>
-          <w:rStyle w:val="notion-enable-hover"/>
-        </w:rPr>
-        <w:t xml:space="preserve"> </w:t>
-      </w:r>
-      <w:r>
+        <w:ind w:left="426"/>
         <w:rPr>
           <w:rFonts w:ascii="Segoe UI" w:eastAsiaTheme="minorEastAsia" w:hAnsi="Segoe UI" w:cstheme="minorBidi"/>
           <w:szCs w:val="22"/>
-        </w:rPr>
-        <w:t xml:space="preserve">- </w:t>
-      </w:r>
-      <w:r>
-        <w:rPr>
-          <w:rFonts w:ascii="Segoe UI" w:eastAsiaTheme="minorEastAsia" w:hAnsi="Segoe UI" w:cstheme="minorBidi"/>
-          <w:szCs w:val="22"/>
-        </w:rPr>
-        <w:t>Smart Consulting | São Paulo, SP</w:t>
-      </w:r>
-      <w:r>
-        <w:rPr>
-          <w:rFonts w:ascii="Segoe UI" w:eastAsiaTheme="minorEastAsia" w:hAnsi="Segoe UI" w:cstheme="minorBidi"/>
-          <w:szCs w:val="22"/>
+          <w:lang w:bidi="pt-BR"/>
+        </w:rPr>
+      </w:pPr>
+      <w:r>
+        <w:rPr>
+          <w:rStyle w:val="notion-enable-hover"/>
+        </w:rPr>
+        <w:t xml:space="preserve">Desenvolvedor Dynamics </w:t>
+      </w:r>
+      <w:r>
+        <w:rPr>
+          <w:rStyle w:val="notion-enable-hover"/>
+        </w:rPr>
+        <w:t>365/Power Platform</w:t>
+      </w:r>
+    </w:p>
+    <w:p>
+      <w:pPr>
+        <w:pStyle w:val="Heading3"/>
+        <w:tabs>
+          <w:tab w:val="clear" w:pos="9360"/>
+          <w:tab w:val="right" w:pos="10348"/>
+        </w:tabs>
+        <w:ind w:left="426" w:right="118"/>
+        <w:rPr>
+          <w:lang w:bidi="pt-BR"/>
+        </w:rPr>
+      </w:pPr>
+      <w:r>
+        <w:t>Best.Projects | São Paulo, SP (</w:t>
+      </w:r>
+      <w:r>
+        <w:t>Remoto</w:t>
+      </w:r>
+      <w:r>
+        <w:t>)</w:t>
+      </w:r>
+      <w:r>
+        <w:rPr>
+          <w:lang w:bidi="pt-BR"/>
         </w:rPr>
         <w:tab/>
-        <w:t xml:space="preserve">Mar/2017 </w:t>
-      </w:r>
-      <w:r>
-        <w:rPr>
-          <w:rFonts w:ascii="Segoe UI" w:eastAsiaTheme="minorEastAsia" w:hAnsi="Segoe UI" w:cstheme="minorBidi"/>
-          <w:szCs w:val="22"/>
-        </w:rPr>
+      </w:r>
+      <w:r>
+        <w:t xml:space="preserve">Jul/2020 </w:t>
+      </w:r>
+      <w:r>
         <w:t>-</w:t>
       </w:r>
       <w:r>
-        <w:rPr>
-          <w:rFonts w:ascii="Segoe UI" w:eastAsiaTheme="minorEastAsia" w:hAnsi="Segoe UI" w:cstheme="minorBidi"/>
-          <w:szCs w:val="22"/>
-        </w:rPr>
-        <w:t> Abr/2020</w:t>
+        <w:t xml:space="preserve"> Mai/2021</w:t>
       </w:r>
     </w:p>
     <w:p>
@@ -1252,64 +1299,60 @@
           <w:tab w:val="right" w:pos="10348"/>
         </w:tabs>
         <w:ind w:left="426" w:right="118"/>
+      </w:pPr>
+      <w:r>
+        <w:rPr>
+          <w:rStyle w:val="notion-enable-hover"/>
+        </w:rPr>
+        <w:t xml:space="preserve">Analista Desenvolvedor Dynamics </w:t>
+      </w:r>
+      <w:r>
+        <w:rPr>
+          <w:rStyle w:val="notion-enable-hover"/>
+        </w:rPr>
+        <w:t>365/Power Platform</w:t>
+      </w:r>
+      <w:r>
+        <w:rPr>
+          <w:rStyle w:val="notion-enable-hover"/>
+        </w:rPr>
+        <w:t xml:space="preserve"> </w:t>
+      </w:r>
+      <w:r>
         <w:rPr>
           <w:rFonts w:ascii="Segoe UI" w:eastAsiaTheme="minorEastAsia" w:hAnsi="Segoe UI" w:cstheme="minorBidi"/>
           <w:szCs w:val="22"/>
         </w:rPr>
-      </w:pPr>
-      <w:r>
-        <w:rPr>
-          <w:rStyle w:val="notion-enable-hover"/>
-        </w:rPr>
-        <w:t xml:space="preserve">Analista Desenvolvedor Dynamics </w:t>
-      </w:r>
-      <w:r>
-        <w:rPr>
-          <w:rStyle w:val="notion-enable-hover"/>
-        </w:rPr>
-        <w:t>365/Power Platform</w:t>
-      </w:r>
-      <w:r>
-        <w:rPr>
-          <w:rStyle w:val="notion-enable-hover"/>
-        </w:rPr>
-        <w:t xml:space="preserve"> </w:t>
+        <w:t xml:space="preserve">- </w:t>
       </w:r>
       <w:r>
         <w:rPr>
           <w:rFonts w:ascii="Segoe UI" w:eastAsiaTheme="minorEastAsia" w:hAnsi="Segoe UI" w:cstheme="minorBidi"/>
           <w:szCs w:val="22"/>
         </w:rPr>
-        <w:t xml:space="preserve">- </w:t>
+        <w:t>Smart Consulting | São Paulo, SP</w:t>
       </w:r>
       <w:r>
         <w:rPr>
           <w:rFonts w:ascii="Segoe UI" w:eastAsiaTheme="minorEastAsia" w:hAnsi="Segoe UI" w:cstheme="minorBidi"/>
           <w:szCs w:val="22"/>
         </w:rPr>
-        <w:t>I4D IT Solutions | São Paulo, SP (Híbrido)</w:t>
+        <w:tab/>
+        <w:t xml:space="preserve">Mar/2017 </w:t>
       </w:r>
       <w:r>
         <w:rPr>
           <w:rFonts w:ascii="Segoe UI" w:eastAsiaTheme="minorEastAsia" w:hAnsi="Segoe UI" w:cstheme="minorBidi"/>
           <w:szCs w:val="22"/>
         </w:rPr>
-        <w:tab/>
-        <w:t xml:space="preserve">Ago/2015 </w:t>
+        <w:t>-</w:t>
       </w:r>
       <w:r>
         <w:rPr>
           <w:rFonts w:ascii="Segoe UI" w:eastAsiaTheme="minorEastAsia" w:hAnsi="Segoe UI" w:cstheme="minorBidi"/>
           <w:szCs w:val="22"/>
         </w:rPr>
-        <w:t>-</w:t>
-      </w:r>
-      <w:r>
-        <w:rPr>
-          <w:rFonts w:ascii="Segoe UI" w:eastAsiaTheme="minorEastAsia" w:hAnsi="Segoe UI" w:cstheme="minorBidi"/>
-          <w:szCs w:val="22"/>
-        </w:rPr>
-        <w:t xml:space="preserve"> Dez/2016</w:t>
+        <w:t> Abr/2020</w:t>
       </w:r>
     </w:p>
     <w:p>
@@ -1323,57 +1366,42 @@
           <w:tab w:val="right" w:pos="10348"/>
         </w:tabs>
         <w:ind w:left="426" w:right="118"/>
-      </w:pPr>
-      <w:r>
-        <w:rPr>
-          <w:rStyle w:val="notion-enable-hover"/>
-        </w:rPr>
-        <w:t>Desenvolvedor </w:t>
-      </w:r>
-      <w:r>
-        <w:rPr>
-          <w:rStyle w:val="notion-enable-hover"/>
-        </w:rPr>
-        <w:t>W</w:t>
-      </w:r>
-      <w:r>
-        <w:rPr>
-          <w:rStyle w:val="notion-enable-hover"/>
-        </w:rPr>
-        <w:t>eb</w:t>
-      </w:r>
-      <w:r>
-        <w:rPr>
-          <w:rStyle w:val="notion-enable-hover"/>
-        </w:rPr>
-        <w:t xml:space="preserve"> (ASP/XHTML/Javascript)</w:t>
-      </w:r>
-      <w:r>
-        <w:rPr>
-          <w:rStyle w:val="notion-enable-hover"/>
-        </w:rPr>
-        <w:t xml:space="preserve"> </w:t>
-      </w:r>
-      <w:r>
         <w:rPr>
           <w:rFonts w:ascii="Segoe UI" w:eastAsiaTheme="minorEastAsia" w:hAnsi="Segoe UI" w:cstheme="minorBidi"/>
           <w:szCs w:val="22"/>
         </w:rPr>
-        <w:t xml:space="preserve">- </w:t>
+      </w:pPr>
+      <w:r>
+        <w:rPr>
+          <w:rStyle w:val="notion-enable-hover"/>
+        </w:rPr>
+        <w:t xml:space="preserve">Analista Desenvolvedor Dynamics </w:t>
+      </w:r>
+      <w:r>
+        <w:rPr>
+          <w:rStyle w:val="notion-enable-hover"/>
+        </w:rPr>
+        <w:t>365/Power Platform</w:t>
+      </w:r>
+      <w:r>
+        <w:rPr>
+          <w:rStyle w:val="notion-enable-hover"/>
+        </w:rPr>
+        <w:t xml:space="preserve"> </w:t>
       </w:r>
       <w:r>
         <w:rPr>
           <w:rFonts w:ascii="Segoe UI" w:eastAsiaTheme="minorEastAsia" w:hAnsi="Segoe UI" w:cstheme="minorBidi"/>
           <w:szCs w:val="22"/>
         </w:rPr>
-        <w:t>Paicon Technologies | São Paulo, S</w:t>
+        <w:t xml:space="preserve">- </w:t>
       </w:r>
       <w:r>
         <w:rPr>
           <w:rFonts w:ascii="Segoe UI" w:eastAsiaTheme="minorEastAsia" w:hAnsi="Segoe UI" w:cstheme="minorBidi"/>
           <w:szCs w:val="22"/>
         </w:rPr>
-        <w:t>P</w:t>
+        <w:t>I4D IT Solutions | São Paulo, SP (Híbrido)</w:t>
       </w:r>
       <w:r>
         <w:rPr>
@@ -1381,7 +1409,7 @@
           <w:szCs w:val="22"/>
         </w:rPr>
         <w:tab/>
-        <w:t xml:space="preserve">Fev/2015 </w:t>
+        <w:t xml:space="preserve">Ago/2015 </w:t>
       </w:r>
       <w:r>
         <w:rPr>
@@ -1395,7 +1423,7 @@
           <w:rFonts w:ascii="Segoe UI" w:eastAsiaTheme="minorEastAsia" w:hAnsi="Segoe UI" w:cstheme="minorBidi"/>
           <w:szCs w:val="22"/>
         </w:rPr>
-        <w:t xml:space="preserve"> Jul/2015</w:t>
+        <w:t xml:space="preserve"> Dez/2016</w:t>
       </w:r>
     </w:p>
     <w:p>
@@ -1409,42 +1437,57 @@
           <w:tab w:val="right" w:pos="10348"/>
         </w:tabs>
         <w:ind w:left="426" w:right="118"/>
+      </w:pPr>
+      <w:r>
+        <w:rPr>
+          <w:rStyle w:val="notion-enable-hover"/>
+        </w:rPr>
+        <w:t>Desenvolvedor </w:t>
+      </w:r>
+      <w:r>
+        <w:rPr>
+          <w:rStyle w:val="notion-enable-hover"/>
+        </w:rPr>
+        <w:t>W</w:t>
+      </w:r>
+      <w:r>
+        <w:rPr>
+          <w:rStyle w:val="notion-enable-hover"/>
+        </w:rPr>
+        <w:t>eb</w:t>
+      </w:r>
+      <w:r>
+        <w:rPr>
+          <w:rStyle w:val="notion-enable-hover"/>
+        </w:rPr>
+        <w:t xml:space="preserve"> (ASP/XHTML/Javascript)</w:t>
+      </w:r>
+      <w:r>
+        <w:rPr>
+          <w:rStyle w:val="notion-enable-hover"/>
+        </w:rPr>
+        <w:t xml:space="preserve"> </w:t>
+      </w:r>
+      <w:r>
         <w:rPr>
           <w:rFonts w:ascii="Segoe UI" w:eastAsiaTheme="minorEastAsia" w:hAnsi="Segoe UI" w:cstheme="minorBidi"/>
           <w:szCs w:val="22"/>
         </w:rPr>
-      </w:pPr>
-      <w:r>
-        <w:rPr>
-          <w:rStyle w:val="notion-enable-hover"/>
-        </w:rPr>
-        <w:t xml:space="preserve">Desenvolvedor Dynamics </w:t>
-      </w:r>
-      <w:r>
-        <w:rPr>
-          <w:rStyle w:val="notion-enable-hover"/>
-        </w:rPr>
-        <w:t>CRM</w:t>
-      </w:r>
-      <w:r>
-        <w:rPr>
-          <w:rStyle w:val="notion-enable-hover"/>
-        </w:rPr>
-        <w:t xml:space="preserve"> </w:t>
+        <w:t xml:space="preserve">- </w:t>
       </w:r>
       <w:r>
         <w:rPr>
           <w:rFonts w:ascii="Segoe UI" w:eastAsiaTheme="minorEastAsia" w:hAnsi="Segoe UI" w:cstheme="minorBidi"/>
           <w:szCs w:val="22"/>
         </w:rPr>
-        <w:t xml:space="preserve">- </w:t>
+        <w:t>Paicon Technologies | São Paulo, S</w:t>
       </w:r>
       <w:r>
         <w:rPr>
           <w:rFonts w:ascii="Segoe UI" w:eastAsiaTheme="minorEastAsia" w:hAnsi="Segoe UI" w:cstheme="minorBidi"/>
           <w:szCs w:val="22"/>
         </w:rPr>
-        <w:t>Smart Consulting | São Paulo, SP</w:t>
+        <w:t>P</w:t>
       </w:r>
       <w:r>
         <w:rPr>
@@ -1452,7 +1495,7 @@
           <w:szCs w:val="22"/>
         </w:rPr>
         <w:tab/>
-        <w:t xml:space="preserve">Mar/2013 </w:t>
+        <w:t xml:space="preserve">Fev/2015 </w:t>
       </w:r>
       <w:r>
         <w:rPr>
@@ -1466,7 +1509,7 @@
           <w:rFonts w:ascii="Segoe UI" w:eastAsiaTheme="minorEastAsia" w:hAnsi="Segoe UI" w:cstheme="minorBidi"/>
           <w:szCs w:val="22"/>
         </w:rPr>
-        <w:t xml:space="preserve"> Dez/2014</w:t>
+        <w:t xml:space="preserve"> Jul/2015</w:t>
       </w:r>
     </w:p>
     <w:p>
@@ -1489,6 +1532,77 @@
         <w:rPr>
           <w:rStyle w:val="notion-enable-hover"/>
         </w:rPr>
+        <w:t xml:space="preserve">Desenvolvedor Dynamics </w:t>
+      </w:r>
+      <w:r>
+        <w:rPr>
+          <w:rStyle w:val="notion-enable-hover"/>
+        </w:rPr>
+        <w:t>CRM</w:t>
+      </w:r>
+      <w:r>
+        <w:rPr>
+          <w:rStyle w:val="notion-enable-hover"/>
+        </w:rPr>
+        <w:t xml:space="preserve"> </w:t>
+      </w:r>
+      <w:r>
+        <w:rPr>
+          <w:rFonts w:ascii="Segoe UI" w:eastAsiaTheme="minorEastAsia" w:hAnsi="Segoe UI" w:cstheme="minorBidi"/>
+          <w:szCs w:val="22"/>
+        </w:rPr>
+        <w:t xml:space="preserve">- </w:t>
+      </w:r>
+      <w:r>
+        <w:rPr>
+          <w:rFonts w:ascii="Segoe UI" w:eastAsiaTheme="minorEastAsia" w:hAnsi="Segoe UI" w:cstheme="minorBidi"/>
+          <w:szCs w:val="22"/>
+        </w:rPr>
+        <w:t>Smart Consulting | São Paulo, SP</w:t>
+      </w:r>
+      <w:r>
+        <w:rPr>
+          <w:rFonts w:ascii="Segoe UI" w:eastAsiaTheme="minorEastAsia" w:hAnsi="Segoe UI" w:cstheme="minorBidi"/>
+          <w:szCs w:val="22"/>
+        </w:rPr>
+        <w:tab/>
+        <w:t xml:space="preserve">Mar/2013 </w:t>
+      </w:r>
+      <w:r>
+        <w:rPr>
+          <w:rFonts w:ascii="Segoe UI" w:eastAsiaTheme="minorEastAsia" w:hAnsi="Segoe UI" w:cstheme="minorBidi"/>
+          <w:szCs w:val="22"/>
+        </w:rPr>
+        <w:t>-</w:t>
+      </w:r>
+      <w:r>
+        <w:rPr>
+          <w:rFonts w:ascii="Segoe UI" w:eastAsiaTheme="minorEastAsia" w:hAnsi="Segoe UI" w:cstheme="minorBidi"/>
+          <w:szCs w:val="22"/>
+        </w:rPr>
+        <w:t xml:space="preserve"> Dez/2014</w:t>
+      </w:r>
+    </w:p>
+    <w:p>
+      <w:pPr>
+        <w:pStyle w:val="Heading2"/>
+        <w:numPr>
+          <w:ilvl w:val="0"/>
+          <w:numId w:val="4"/>
+        </w:numPr>
+        <w:tabs>
+          <w:tab w:val="right" w:pos="10348"/>
+        </w:tabs>
+        <w:ind w:left="426" w:right="118"/>
+        <w:rPr>
+          <w:rFonts w:ascii="Segoe UI" w:eastAsiaTheme="minorEastAsia" w:hAnsi="Segoe UI" w:cstheme="minorBidi"/>
+          <w:szCs w:val="22"/>
+        </w:rPr>
+      </w:pPr>
+      <w:r>
+        <w:rPr>
+          <w:rStyle w:val="notion-enable-hover"/>
+        </w:rPr>
         <w:t>Analista </w:t>
       </w:r>
       <w:r>
@@ -1655,6 +1769,292 @@
       <w:pPr>
         <w:pStyle w:val="Heading1"/>
         <w:ind w:right="16"/>
+      </w:pPr>
+      <w:r>
+        <w:lastRenderedPageBreak/>
+        <w:t>Certificações</w:t>
+      </w:r>
+    </w:p>
+    <w:p>
+      <w:pPr>
+        <w:tabs>
+          <w:tab w:val="right" w:pos="10348"/>
+        </w:tabs>
+        <w:ind w:left="1134" w:right="118" w:hanging="142"/>
+      </w:pPr>
+      <w:r>
+        <w:rPr>
+          <w:rFonts w:ascii="Segoe UI Semibold" w:eastAsiaTheme="majorEastAsia" w:hAnsi="Segoe UI Semibold" w:cstheme="majorBidi"/>
+          <w:szCs w:val="26"/>
+          <w:lang w:val="en-US"/>
+        </w:rPr>
+        <w:drawing>
+          <wp:anchor distT="0" distB="0" distL="114300" distR="114300" simplePos="0" relativeHeight="251682816" behindDoc="0" locked="0" layoutInCell="1" allowOverlap="1" wp14:anchorId="026C5B86" wp14:editId="11FFE6E5">
+            <wp:simplePos x="0" y="0"/>
+            <wp:positionH relativeFrom="margin">
+              <wp:align>left</wp:align>
+            </wp:positionH>
+            <wp:positionV relativeFrom="margin">
+              <wp:posOffset>281940</wp:posOffset>
+            </wp:positionV>
+            <wp:extent cx="457200" cy="478155"/>
+            <wp:effectExtent l="0" t="0" r="0" b="0"/>
+            <wp:wrapSquare wrapText="bothSides"/>
+            <wp:docPr id="2058750253" name="Picture 1" descr="A blue and white logo with a white star&#10;&#10;AI-generated content may be incorrect."/>
+            <wp:cNvGraphicFramePr>
+              <a:graphicFrameLocks xmlns:a="http://schemas.openxmlformats.org/drawingml/2006/main" noChangeAspect="1"/>
+            </wp:cNvGraphicFramePr>
+            <a:graphic xmlns:a="http://schemas.openxmlformats.org/drawingml/2006/main">
+              <a:graphicData uri="http://schemas.openxmlformats.org/drawingml/2006/picture">
+                <pic:pic xmlns:pic="http://schemas.openxmlformats.org/drawingml/2006/picture">
+                  <pic:nvPicPr>
+                    <pic:cNvPr id="976242936" name="Picture 1" descr="A blue and white logo with a white star&#10;&#10;AI-generated content may be incorrect."/>
+                    <pic:cNvPicPr/>
+                  </pic:nvPicPr>
+                  <pic:blipFill>
+                    <a:blip r:embed="rId19">
+                      <a:extLst>
+                        <a:ext uri="{28A0092B-C50C-407E-A947-70E740481C1C}">
+                          <a14:useLocalDpi xmlns:a14="http://schemas.microsoft.com/office/drawing/2010/main" val="0"/>
+                        </a:ext>
+                      </a:extLst>
+                    </a:blip>
+                    <a:stretch>
+                      <a:fillRect/>
+                    </a:stretch>
+                  </pic:blipFill>
+                  <pic:spPr>
+                    <a:xfrm>
+                      <a:off x="0" y="0"/>
+                      <a:ext cx="457200" cy="478155"/>
+                    </a:xfrm>
+                    <a:prstGeom prst="rect">
+                      <a:avLst/>
+                    </a:prstGeom>
+                  </pic:spPr>
+                </pic:pic>
+              </a:graphicData>
+            </a:graphic>
+            <wp14:sizeRelH relativeFrom="margin">
+              <wp14:pctWidth>0</wp14:pctWidth>
+            </wp14:sizeRelH>
+            <wp14:sizeRelV relativeFrom="margin">
+              <wp14:pctHeight>0</wp14:pctHeight>
+            </wp14:sizeRelV>
+          </wp:anchor>
+        </w:drawing>
+      </w:r>
+      <w:r>
+        <w:rPr>
+          <w:rFonts w:ascii="Segoe UI Semibold" w:eastAsiaTheme="majorEastAsia" w:hAnsi="Segoe UI Semibold" w:cstheme="majorBidi"/>
+          <w:szCs w:val="26"/>
+        </w:rPr>
+        <w:t>Microsoft Certified: Azure Fundamentals</w:t>
+      </w:r>
+      <w:r>
+        <w:rPr>
+          <w:rFonts w:ascii="Segoe UI Semibold" w:eastAsiaTheme="majorEastAsia" w:hAnsi="Segoe UI Semibold" w:cstheme="majorBidi"/>
+          <w:szCs w:val="26"/>
+        </w:rPr>
+        <w:tab/>
+      </w:r>
+      <w:r>
+        <w:t>Jun/2025</w:t>
+      </w:r>
+    </w:p>
+    <w:p>
+      <w:pPr>
+        <w:pStyle w:val="ListParagraph"/>
+        <w:numPr>
+          <w:ilvl w:val="0"/>
+          <w:numId w:val="3"/>
+        </w:numPr>
+        <w:tabs>
+          <w:tab w:val="right" w:pos="10348"/>
+        </w:tabs>
+        <w:ind w:left="1134" w:right="118" w:hanging="142"/>
+        <w:rPr>
+          <w:lang w:val="en-US"/>
+        </w:rPr>
+      </w:pPr>
+      <w:r>
+        <w:rPr>
+          <w:lang w:val="en-US"/>
+        </w:rPr>
+        <w:t xml:space="preserve">Exam </w:t>
+      </w:r>
+      <w:r>
+        <w:rPr>
+          <w:lang w:val="en-US"/>
+        </w:rPr>
+        <w:t>AZ-900: Azure Fundamentals</w:t>
+      </w:r>
+    </w:p>
+    <w:p>
+      <w:pPr>
+        <w:tabs>
+          <w:tab w:val="right" w:pos="10348"/>
+        </w:tabs>
+        <w:ind w:left="992" w:right="118"/>
+        <w:rPr>
+          <w:lang w:val="en-US"/>
+        </w:rPr>
+      </w:pPr>
+    </w:p>
+    <w:p>
+      <w:pPr>
+        <w:tabs>
+          <w:tab w:val="right" w:pos="10348"/>
+        </w:tabs>
+        <w:ind w:left="1134" w:right="118" w:hanging="142"/>
+        <w:rPr>
+          <w:lang w:val="en-US"/>
+        </w:rPr>
+      </w:pPr>
+      <w:r>
+        <w:rPr>
+          <w:rFonts w:ascii="Segoe UI Semibold" w:eastAsiaTheme="majorEastAsia" w:hAnsi="Segoe UI Semibold" w:cstheme="majorBidi"/>
+          <w:szCs w:val="26"/>
+          <w:lang w:val="en-US"/>
+        </w:rPr>
+        <w:drawing>
+          <wp:anchor distT="0" distB="0" distL="114300" distR="114300" simplePos="0" relativeHeight="251681792" behindDoc="0" locked="0" layoutInCell="1" allowOverlap="1" wp14:anchorId="2149900D" wp14:editId="1E27F753">
+            <wp:simplePos x="0" y="0"/>
+            <wp:positionH relativeFrom="margin">
+              <wp:align>left</wp:align>
+            </wp:positionH>
+            <wp:positionV relativeFrom="margin">
+              <wp:posOffset>935990</wp:posOffset>
+            </wp:positionV>
+            <wp:extent cx="457200" cy="478155"/>
+            <wp:effectExtent l="0" t="0" r="0" b="0"/>
+            <wp:wrapSquare wrapText="bothSides"/>
+            <wp:docPr id="976242936" name="Picture 1" descr="A blue and white logo with a white star&#10;&#10;AI-generated content may be incorrect."/>
+            <wp:cNvGraphicFramePr>
+              <a:graphicFrameLocks xmlns:a="http://schemas.openxmlformats.org/drawingml/2006/main" noChangeAspect="1"/>
+            </wp:cNvGraphicFramePr>
+            <a:graphic xmlns:a="http://schemas.openxmlformats.org/drawingml/2006/main">
+              <a:graphicData uri="http://schemas.openxmlformats.org/drawingml/2006/picture">
+                <pic:pic xmlns:pic="http://schemas.openxmlformats.org/drawingml/2006/picture">
+                  <pic:nvPicPr>
+                    <pic:cNvPr id="976242936" name="Picture 1" descr="A blue and white logo with a white star&#10;&#10;AI-generated content may be incorrect."/>
+                    <pic:cNvPicPr/>
+                  </pic:nvPicPr>
+                  <pic:blipFill>
+                    <a:blip r:embed="rId19">
+                      <a:extLst>
+                        <a:ext uri="{28A0092B-C50C-407E-A947-70E740481C1C}">
+                          <a14:useLocalDpi xmlns:a14="http://schemas.microsoft.com/office/drawing/2010/main" val="0"/>
+                        </a:ext>
+                      </a:extLst>
+                    </a:blip>
+                    <a:stretch>
+                      <a:fillRect/>
+                    </a:stretch>
+                  </pic:blipFill>
+                  <pic:spPr>
+                    <a:xfrm>
+                      <a:off x="0" y="0"/>
+                      <a:ext cx="461693" cy="483471"/>
+                    </a:xfrm>
+                    <a:prstGeom prst="rect">
+                      <a:avLst/>
+                    </a:prstGeom>
+                  </pic:spPr>
+                </pic:pic>
+              </a:graphicData>
+            </a:graphic>
+            <wp14:sizeRelH relativeFrom="margin">
+              <wp14:pctWidth>0</wp14:pctWidth>
+            </wp14:sizeRelH>
+            <wp14:sizeRelV relativeFrom="margin">
+              <wp14:pctHeight>0</wp14:pctHeight>
+            </wp14:sizeRelV>
+          </wp:anchor>
+        </w:drawing>
+      </w:r>
+      <w:r>
+        <w:rPr>
+          <w:rFonts w:ascii="Segoe UI Semibold" w:eastAsiaTheme="majorEastAsia" w:hAnsi="Segoe UI Semibold" w:cstheme="majorBidi"/>
+          <w:szCs w:val="26"/>
+          <w:lang w:val="en-US"/>
+        </w:rPr>
+        <w:t>Microsoft Certified: Azure AI Fundamentals</w:t>
+      </w:r>
+      <w:r>
+        <w:rPr>
+          <w:rFonts w:ascii="Segoe UI Semibold" w:eastAsiaTheme="majorEastAsia" w:hAnsi="Segoe UI Semibold" w:cstheme="majorBidi"/>
+          <w:szCs w:val="26"/>
+          <w:lang w:val="en-US"/>
+        </w:rPr>
+        <w:tab/>
+      </w:r>
+      <w:r>
+        <w:rPr>
+          <w:lang w:val="en-US"/>
+        </w:rPr>
+        <w:t>Mai</w:t>
+      </w:r>
+      <w:r>
+        <w:rPr>
+          <w:lang w:val="en-US"/>
+        </w:rPr>
+        <w:t>/202</w:t>
+      </w:r>
+      <w:r>
+        <w:rPr>
+          <w:lang w:val="en-US"/>
+        </w:rPr>
+        <w:t>5</w:t>
+      </w:r>
+    </w:p>
+    <w:p>
+      <w:pPr>
+        <w:pStyle w:val="ListParagraph"/>
+        <w:numPr>
+          <w:ilvl w:val="0"/>
+          <w:numId w:val="3"/>
+        </w:numPr>
+        <w:tabs>
+          <w:tab w:val="right" w:pos="10348"/>
+        </w:tabs>
+        <w:ind w:left="1134" w:right="118" w:hanging="142"/>
+        <w:rPr>
+          <w:lang w:val="en-US"/>
+        </w:rPr>
+      </w:pPr>
+      <w:r>
+        <w:rPr>
+          <w:lang w:val="en-US"/>
+        </w:rPr>
+        <w:t xml:space="preserve">Exam </w:t>
+      </w:r>
+      <w:r>
+        <w:rPr>
+          <w:lang w:val="en-US"/>
+        </w:rPr>
+        <w:t>AI-900: Azure AI Fundamentals</w:t>
+      </w:r>
+    </w:p>
+    <w:p>
+      <w:pPr>
+        <w:tabs>
+          <w:tab w:val="right" w:pos="10348"/>
+        </w:tabs>
+        <w:ind w:right="118"/>
+        <w:rPr>
+          <w:rFonts w:ascii="Segoe UI Semibold" w:eastAsiaTheme="majorEastAsia" w:hAnsi="Segoe UI Semibold" w:cstheme="majorBidi"/>
+          <w:szCs w:val="26"/>
+          <w:lang w:val="en-US"/>
+        </w:rPr>
+      </w:pPr>
+    </w:p>
+    <w:p>
+      <w:pPr>
+        <w:tabs>
+          <w:tab w:val="right" w:pos="10348"/>
+        </w:tabs>
+        <w:ind w:left="1134" w:right="118" w:hanging="142"/>
         <w:rPr>
           <w:lang w:val="en-US"/>
         </w:rPr>
@@ -1666,15 +2066,14 @@
           <w:szCs w:val="26"/>
           <w:lang w:val="en-US"/>
         </w:rPr>
-        <w:lastRenderedPageBreak/>
         <w:drawing>
-          <wp:anchor distT="0" distB="0" distL="114300" distR="114300" simplePos="0" relativeHeight="251679744" behindDoc="0" locked="0" layoutInCell="1" allowOverlap="1" wp14:anchorId="38940525" wp14:editId="6275C7AE">
+          <wp:anchor distT="0" distB="0" distL="114300" distR="114300" simplePos="0" relativeHeight="251679744" behindDoc="0" locked="0" layoutInCell="1" allowOverlap="1" wp14:anchorId="38940525" wp14:editId="3F2AD4B6">
             <wp:simplePos x="0" y="0"/>
             <wp:positionH relativeFrom="margin">
               <wp:align>left</wp:align>
             </wp:positionH>
             <wp:positionV relativeFrom="paragraph">
-              <wp:posOffset>276225</wp:posOffset>
+              <wp:posOffset>13335</wp:posOffset>
             </wp:positionV>
             <wp:extent cx="415290" cy="447675"/>
             <wp:effectExtent l="0" t="0" r="3810" b="9525"/>
@@ -1691,7 +2090,7 @@
                     <pic:cNvPicPr/>
                   </pic:nvPicPr>
                   <pic:blipFill>
-                    <a:blip r:embed="rId19" cstate="print">
+                    <a:blip r:embed="rId20" cstate="print">
                       <a:extLst>
                         <a:ext uri="{28A0092B-C50C-407E-A947-70E740481C1C}">
                           <a14:useLocalDpi xmlns:a14="http://schemas.microsoft.com/office/drawing/2010/main" val="0"/>
@@ -1725,23 +2124,6 @@
       </w:r>
       <w:r>
         <w:rPr>
-          <w:lang w:val="en-US"/>
-        </w:rPr>
-        <w:t>Certificações</w:t>
-      </w:r>
-    </w:p>
-    <w:p>
-      <w:pPr>
-        <w:tabs>
-          <w:tab w:val="right" w:pos="10348"/>
-        </w:tabs>
-        <w:ind w:left="1134" w:right="118" w:hanging="142"/>
-        <w:rPr>
-          <w:lang w:val="en-US"/>
-        </w:rPr>
-      </w:pPr>
-      <w:r>
-        <w:rPr>
           <w:rFonts w:ascii="Segoe UI Semibold" w:eastAsiaTheme="majorEastAsia" w:hAnsi="Segoe UI Semibold" w:cstheme="majorBidi"/>
           <w:szCs w:val="26"/>
           <w:lang w:val="en-US"/>
@@ -1816,7 +2198,7 @@
           <w:lang w:val="en-US"/>
         </w:rPr>
         <w:drawing>
-          <wp:anchor distT="0" distB="0" distL="114300" distR="114300" simplePos="0" relativeHeight="251677696" behindDoc="0" locked="0" layoutInCell="1" allowOverlap="1" wp14:anchorId="3AB655E1" wp14:editId="58738302">
+          <wp:anchor distT="0" distB="0" distL="114300" distR="114300" simplePos="0" relativeHeight="251677696" behindDoc="0" locked="0" layoutInCell="1" allowOverlap="1" wp14:anchorId="3AB655E1" wp14:editId="48A6B998">
             <wp:simplePos x="0" y="0"/>
             <wp:positionH relativeFrom="margin">
               <wp:align>left</wp:align>
@@ -1839,7 +2221,7 @@
                     <pic:cNvPicPr/>
                   </pic:nvPicPr>
                   <pic:blipFill>
-                    <a:blip r:embed="rId19" cstate="print">
+                    <a:blip r:embed="rId20" cstate="print">
                       <a:extLst>
                         <a:ext uri="{28A0092B-C50C-407E-A947-70E740481C1C}">
                           <a14:useLocalDpi xmlns:a14="http://schemas.microsoft.com/office/drawing/2010/main" val="0"/>
@@ -2008,13 +2390,13 @@
                     <pic:cNvPicPr/>
                   </pic:nvPicPr>
                   <pic:blipFill>
-                    <a:blip r:embed="rId20" cstate="print">
+                    <a:blip r:embed="rId21" cstate="print">
                       <a:extLst>
                         <a:ext uri="{28A0092B-C50C-407E-A947-70E740481C1C}">
                           <a14:useLocalDpi xmlns:a14="http://schemas.microsoft.com/office/drawing/2010/main" val="0"/>
                         </a:ext>
                         <a:ext uri="{96DAC541-7B7A-43D3-8B79-37D633B846F1}">
-                          <asvg:svgBlip xmlns:asvg="http://schemas.microsoft.com/office/drawing/2016/SVG/main" r:embed="rId21"/>
+                          <asvg:svgBlip xmlns:asvg="http://schemas.microsoft.com/office/drawing/2016/SVG/main" r:embed="rId22"/>
                         </a:ext>
                       </a:extLst>
                     </a:blip>
@@ -2135,7 +2517,7 @@
           <w:noProof/>
         </w:rPr>
         <w:drawing>
-          <wp:anchor distT="0" distB="0" distL="114300" distR="114300" simplePos="0" relativeHeight="251670528" behindDoc="0" locked="0" layoutInCell="1" allowOverlap="1" wp14:anchorId="44E1D72F" wp14:editId="66A4F0BD">
+          <wp:anchor distT="0" distB="0" distL="114300" distR="114300" simplePos="0" relativeHeight="251670528" behindDoc="0" locked="0" layoutInCell="1" allowOverlap="1" wp14:anchorId="44E1D72F" wp14:editId="35F665A8">
             <wp:simplePos x="0" y="0"/>
             <wp:positionH relativeFrom="margin">
               <wp:align>left</wp:align>
@@ -2158,7 +2540,7 @@
                     <pic:cNvPicPr/>
                   </pic:nvPicPr>
                   <pic:blipFill>
-                    <a:blip r:embed="rId22" cstate="print">
+                    <a:blip r:embed="rId23" cstate="print">
                       <a:extLst>
                         <a:ext uri="{28A0092B-C50C-407E-A947-70E740481C1C}">
                           <a14:useLocalDpi xmlns:a14="http://schemas.microsoft.com/office/drawing/2010/main" val="0"/>
@@ -2263,75 +2645,6 @@
           <w:lang w:val="en-US"/>
         </w:rPr>
       </w:pPr>
-      <w:r>
-        <w:rPr>
-          <w:rFonts w:ascii="Segoe UI Semibold" w:eastAsiaTheme="majorEastAsia" w:hAnsi="Segoe UI Semibold" w:cstheme="majorBidi"/>
-          <w:noProof/>
-          <w:szCs w:val="26"/>
-        </w:rPr>
-        <w:drawing>
-          <wp:anchor distT="0" distB="0" distL="114300" distR="114300" simplePos="0" relativeHeight="251667456" behindDoc="0" locked="0" layoutInCell="1" allowOverlap="1" wp14:anchorId="09BE431B" wp14:editId="070EA8EF">
-            <wp:simplePos x="0" y="0"/>
-            <wp:positionH relativeFrom="margin">
-              <wp:align>left</wp:align>
-            </wp:positionH>
-            <wp:positionV relativeFrom="paragraph">
-              <wp:posOffset>191770</wp:posOffset>
-            </wp:positionV>
-            <wp:extent cx="409575" cy="409575"/>
-            <wp:effectExtent l="0" t="0" r="9525" b="9525"/>
-            <wp:wrapSquare wrapText="bothSides"/>
-            <wp:docPr id="99307844" name="Imagem 99307844" descr="Placa azul com letras brancas&#10;&#10;Descrição gerada automaticamente"/>
-            <wp:cNvGraphicFramePr>
-              <a:graphicFrameLocks xmlns:a="http://schemas.openxmlformats.org/drawingml/2006/main" noChangeAspect="1"/>
-            </wp:cNvGraphicFramePr>
-            <a:graphic xmlns:a="http://schemas.openxmlformats.org/drawingml/2006/main">
-              <a:graphicData uri="http://schemas.openxmlformats.org/drawingml/2006/picture">
-                <pic:pic xmlns:pic="http://schemas.openxmlformats.org/drawingml/2006/picture">
-                  <pic:nvPicPr>
-                    <pic:cNvPr id="22" name="Imagem 22" descr="Placa azul com letras brancas&#10;&#10;Descrição gerada automaticamente"/>
-                    <pic:cNvPicPr>
-                      <a:picLocks noChangeAspect="1" noChangeArrowheads="1"/>
-                    </pic:cNvPicPr>
-                  </pic:nvPicPr>
-                  <pic:blipFill>
-                    <a:blip r:embed="rId23" cstate="print">
-                      <a:extLst>
-                        <a:ext uri="{28A0092B-C50C-407E-A947-70E740481C1C}">
-                          <a14:useLocalDpi xmlns:a14="http://schemas.microsoft.com/office/drawing/2010/main" val="0"/>
-                        </a:ext>
-                      </a:extLst>
-                    </a:blip>
-                    <a:srcRect/>
-                    <a:stretch>
-                      <a:fillRect/>
-                    </a:stretch>
-                  </pic:blipFill>
-                  <pic:spPr bwMode="auto">
-                    <a:xfrm>
-                      <a:off x="0" y="0"/>
-                      <a:ext cx="409575" cy="409575"/>
-                    </a:xfrm>
-                    <a:prstGeom prst="rect">
-                      <a:avLst/>
-                    </a:prstGeom>
-                    <a:noFill/>
-                    <a:ln>
-                      <a:noFill/>
-                    </a:ln>
-                  </pic:spPr>
-                </pic:pic>
-              </a:graphicData>
-            </a:graphic>
-            <wp14:sizeRelH relativeFrom="margin">
-              <wp14:pctWidth>0</wp14:pctWidth>
-            </wp14:sizeRelH>
-            <wp14:sizeRelV relativeFrom="margin">
-              <wp14:pctHeight>0</wp14:pctHeight>
-            </wp14:sizeRelV>
-          </wp:anchor>
-        </w:drawing>
-      </w:r>
     </w:p>
     <w:p>
       <w:pPr>
@@ -2358,46 +2671,6 @@
         <w:tab/>
         <w:t xml:space="preserve"> Mar/2023</w:t>
       </w:r>
-    </w:p>
-    <w:p>
-      <w:pPr>
-        <w:pStyle w:val="ListParagraph"/>
-        <w:numPr>
-          <w:ilvl w:val="0"/>
-          <w:numId w:val="3"/>
-        </w:numPr>
-        <w:tabs>
-          <w:tab w:val="right" w:pos="10348"/>
-        </w:tabs>
-        <w:ind w:left="1134" w:right="118" w:hanging="142"/>
-        <w:rPr>
-          <w:lang w:val="en-US"/>
-        </w:rPr>
-      </w:pPr>
-      <w:r>
-        <w:rPr>
-          <w:lang w:val="en-US"/>
-        </w:rPr>
-        <w:t>Exam PL-900: Power Platform Fundamental</w:t>
-      </w:r>
-      <w:r>
-        <w:rPr>
-          <w:lang w:val="en-US"/>
-        </w:rPr>
-        <w:t>s</w:t>
-      </w:r>
-    </w:p>
-    <w:p>
-      <w:pPr>
-        <w:pStyle w:val="ListParagraph"/>
-        <w:tabs>
-          <w:tab w:val="right" w:pos="10348"/>
-        </w:tabs>
-        <w:ind w:left="1134" w:right="118" w:hanging="142"/>
-        <w:rPr>
-          <w:lang w:val="en-US"/>
-        </w:rPr>
-      </w:pPr>
     </w:p>
     <w:p>
       <w:pPr>
@@ -2973,132 +3246,37 @@
 <file path=word/numbering.xml><?xml version="1.0" encoding="utf-8"?>
 <w:numbering xmlns:wpc="http://schemas.microsoft.com/office/word/2010/wordprocessingCanvas" xmlns:cx="http://schemas.microsoft.com/office/drawing/2014/chartex" xmlns:cx1="http://schemas.microsoft.com/office/drawing/2015/9/8/chartex" xmlns:cx2="http://schemas.microsoft.com/office/drawing/2015/10/21/chartex" xmlns:cx3="http://schemas.microsoft.com/office/drawing/2016/5/9/chartex" xmlns:cx4="http://schemas.microsoft.com/office/drawing/2016/5/10/chartex" xmlns:cx5="http://schemas.microsoft.com/office/drawing/2016/5/11/chartex" xmlns:cx6="http://schemas.microsoft.com/office/drawing/2016/5/12/chartex" xmlns:cx7="http://schemas.microsoft.com/office/drawing/2016/5/13/chartex" xmlns:cx8="http://schemas.microsoft.com/office/drawing/2016/5/14/chartex" xmlns:mc="http://schemas.openxmlformats.org/markup-compatibility/2006" xmlns:aink="http://schemas.microsoft.com/office/drawing/2016/ink" xmlns:am3d="http://schemas.microsoft.com/office/drawing/2017/model3d" xmlns:o="urn:schemas-microsoft-com:office:office" xmlns:oel="http://schemas.microsoft.com/office/2019/extlst" xmlns:r="http://schemas.openxmlformats.org/officeDocument/2006/relationships" xmlns:m="http://schemas.openxmlformats.org/officeDocument/2006/math" xmlns:v="urn:schemas-microsoft-com:vml" xmlns:wp14="http://schemas.microsoft.com/office/word/2010/wordprocessingDrawing" xmlns:wp="http://schemas.openxmlformats.org/drawingml/2006/wordprocessingDrawing" xmlns:w10="urn:schemas-microsoft-com:office:word" xmlns:w="http://schemas.openxmlformats.org/wordprocessingml/2006/main" xmlns:w14="http://schemas.microsoft.com/office/word/2010/wordml" xmlns:w15="http://schemas.microsoft.com/office/word/2012/wordml" xmlns:w16cex="http://schemas.microsoft.com/office/word/2018/wordml/cex" xmlns:w16cid="http://schemas.microsoft.com/office/word/2016/wordml/cid" xmlns:w16="http://schemas.microsoft.com/office/word/2018/wordml" xmlns:w16du="http://schemas.microsoft.com/office/word/2023/wordml/word16du" xmlns:w16sdtdh="http://schemas.microsoft.com/office/word/2020/wordml/sdtdatahash" xmlns:w16sdtfl="http://schemas.microsoft.com/office/word/2024/wordml/sdtformatlock" xmlns:w16se="http://schemas.microsoft.com/office/word/2015/wordml/symex" xmlns:wpg="http://schemas.microsoft.com/office/word/2010/wordprocessingGroup" xmlns:wpi="http://schemas.microsoft.com/office/word/2010/wordprocessingInk" xmlns:wne="http://schemas.microsoft.com/office/word/2006/wordml" xmlns:wps="http://schemas.microsoft.com/office/word/2010/wordprocessingShape" mc:Ignorable="w14 w15 w16se w16cid w16 w16cex w16sdtdh w16sdtfl w16du wp14">
   <w:numPicBullet w:numPicBulletId="0">
-    <mc:AlternateContent>
-      <mc:Choice Requires="v">
-        <w:pict>
-          <v:shapetype w14:anchorId="5EAEE5E3" id="_x0000_t75" coordsize="21600,21600" o:spt="75" o:preferrelative="t" path="m@4@5l@4@11@9@11@9@5xe" filled="f" stroked="f">
-            <v:stroke joinstyle="miter"/>
-            <v:formulas>
-              <v:f eqn="if lineDrawn pixelLineWidth 0"/>
-              <v:f eqn="sum @0 1 0"/>
-              <v:f eqn="sum 0 0 @1"/>
-              <v:f eqn="prod @2 1 2"/>
-              <v:f eqn="prod @3 21600 pixelWidth"/>
-              <v:f eqn="prod @3 21600 pixelHeight"/>
-              <v:f eqn="sum @0 0 1"/>
-              <v:f eqn="prod @6 1 2"/>
-              <v:f eqn="prod @7 21600 pixelWidth"/>
-              <v:f eqn="sum @8 21600 0"/>
-              <v:f eqn="prod @7 21600 pixelHeight"/>
-              <v:f eqn="sum @10 21600 0"/>
-            </v:formulas>
-            <v:path o:extrusionok="f" gradientshapeok="t" o:connecttype="rect"/>
-            <o:lock v:ext="edit" aspectratio="t"/>
-          </v:shapetype>
-          <v:shape id="Picture 744083963" o:spid="_x0000_i1025" type="#_x0000_t75" alt="Ícone&#10;&#10;Descrição gerada automaticamente" style="width:55.5pt;height:48pt;flip:x;visibility:visible;mso-wrap-style:square">
-            <v:imagedata r:id="rId1" o:title="Ícone&#10;&#10;Descrição gerada automaticamente"/>
-          </v:shape>
-        </w:pict>
-      </mc:Choice>
-      <mc:Fallback>
-        <w:drawing>
-          <wp:inline distT="0" distB="0" distL="0" distR="0" wp14:anchorId="6190124F" wp14:editId="6F1B3F55">
-            <wp:extent cx="704850" cy="609600"/>
-            <wp:effectExtent l="0" t="0" r="0" b="0"/>
-            <wp:docPr id="744083963" name="Picture 744083963" descr="Ícone&#10;&#10;Descrição gerada automaticamente"/>
-            <wp:cNvGraphicFramePr>
-              <a:graphicFrameLocks xmlns:a="http://schemas.openxmlformats.org/drawingml/2006/main" noChangeAspect="1"/>
-            </wp:cNvGraphicFramePr>
-            <a:graphic xmlns:a="http://schemas.openxmlformats.org/drawingml/2006/main">
-              <a:graphicData uri="http://schemas.openxmlformats.org/drawingml/2006/picture">
-                <pic:pic xmlns:pic="http://schemas.openxmlformats.org/drawingml/2006/picture">
-                  <pic:nvPicPr>
-                    <pic:cNvPr id="0" name="Picture -1023" descr="Ícone&#10;&#10;Descrição gerada automaticamente"/>
-                    <pic:cNvPicPr>
-                      <a:picLocks noChangeAspect="1" noChangeArrowheads="1"/>
-                    </pic:cNvPicPr>
-                  </pic:nvPicPr>
-                  <pic:blipFill>
-                    <a:blip r:embed="rId2">
-                      <a:extLst>
-                        <a:ext uri="{28A0092B-C50C-407E-A947-70E740481C1C}">
-                          <a14:useLocalDpi xmlns:a14="http://schemas.microsoft.com/office/drawing/2010/main" val="0"/>
-                        </a:ext>
-                      </a:extLst>
-                    </a:blip>
-                    <a:srcRect/>
-                    <a:stretch>
-                      <a:fillRect/>
-                    </a:stretch>
-                  </pic:blipFill>
-                  <pic:spPr bwMode="auto">
-                    <a:xfrm flipH="1">
-                      <a:off x="0" y="0"/>
-                      <a:ext cx="704850" cy="609600"/>
-                    </a:xfrm>
-                    <a:prstGeom prst="rect">
-                      <a:avLst/>
-                    </a:prstGeom>
-                    <a:noFill/>
-                    <a:ln>
-                      <a:noFill/>
-                    </a:ln>
-                  </pic:spPr>
-                </pic:pic>
-              </a:graphicData>
-            </a:graphic>
-          </wp:inline>
-        </w:drawing>
-      </mc:Fallback>
-    </mc:AlternateContent>
+    <w:pict>
+      <v:shapetype id="_x0000_t75" coordsize="21600,21600" o:spt="75" o:preferrelative="t" path="m@4@5l@4@11@9@11@9@5xe" filled="f" stroked="f">
+        <v:stroke joinstyle="miter"/>
+        <v:formulas>
+          <v:f eqn="if lineDrawn pixelLineWidth 0"/>
+          <v:f eqn="sum @0 1 0"/>
+          <v:f eqn="sum 0 0 @1"/>
+          <v:f eqn="prod @2 1 2"/>
+          <v:f eqn="prod @3 21600 pixelWidth"/>
+          <v:f eqn="prod @3 21600 pixelHeight"/>
+          <v:f eqn="sum @0 0 1"/>
+          <v:f eqn="prod @6 1 2"/>
+          <v:f eqn="prod @7 21600 pixelWidth"/>
+          <v:f eqn="sum @8 21600 0"/>
+          <v:f eqn="prod @7 21600 pixelHeight"/>
+          <v:f eqn="sum @10 21600 0"/>
+        </v:formulas>
+        <v:path o:extrusionok="f" gradientshapeok="t" o:connecttype="rect"/>
+        <o:lock v:ext="edit" aspectratio="t"/>
+      </v:shapetype>
+      <v:shape id="_x0000_i1059" type="#_x0000_t75" alt="Ícone&#10;&#10;Descrição gerada automaticamente" style="width:55.5pt;height:48pt;flip:x;visibility:visible;mso-wrap-style:square" o:bullet="t">
+        <v:imagedata r:id="rId1" o:title="Ícone&#10;&#10;Descrição gerada automaticamente"/>
+      </v:shape>
+    </w:pict>
   </w:numPicBullet>
   <w:numPicBullet w:numPicBulletId="1">
-    <mc:AlternateContent>
-      <mc:Choice Requires="v">
-        <w:pict>
-          <v:shape w14:anchorId="49531B3F" id="Imagem 919093009" o:spid="_x0000_i1025" type="#_x0000_t75" alt="A black and white logo&#10;&#10;AI-generated content may be incorrect." style="width:9.55pt;height:9.65pt;flip:x;visibility:visible;mso-wrap-style:square">
-            <v:imagedata r:id="rId3" o:title="A black and white logo&#10;&#10;AI-generated content may be incorrect"/>
-          </v:shape>
-        </w:pict>
-      </mc:Choice>
-      <mc:Fallback>
-        <w:drawing>
-          <wp:inline distT="0" distB="0" distL="0" distR="0" wp14:anchorId="03598988" wp14:editId="1CFDDE61">
-            <wp:extent cx="121245" cy="122830"/>
-            <wp:effectExtent l="0" t="0" r="0" b="0"/>
-            <wp:docPr id="1113054719" name="Imagem 919093009" descr="A black and white logo&#10;&#10;AI-generated content may be incorrect."/>
-            <wp:cNvGraphicFramePr>
-              <a:graphicFrameLocks xmlns:a="http://schemas.openxmlformats.org/drawingml/2006/main" noChangeAspect="1"/>
-            </wp:cNvGraphicFramePr>
-            <a:graphic xmlns:a="http://schemas.openxmlformats.org/drawingml/2006/main">
-              <a:graphicData uri="http://schemas.openxmlformats.org/drawingml/2006/picture">
-                <pic:pic xmlns:pic="http://schemas.openxmlformats.org/drawingml/2006/picture">
-                  <pic:nvPicPr>
-                    <pic:cNvPr id="919093009" name="Imagem 919093009" descr="A black and white logo&#10;&#10;AI-generated content may be incorrect."/>
-                    <pic:cNvPicPr/>
-                  </pic:nvPicPr>
-                  <pic:blipFill>
-                    <a:blip r:embed="rId4"/>
-                    <a:stretch>
-                      <a:fillRect/>
-                    </a:stretch>
-                  </pic:blipFill>
-                  <pic:spPr>
-                    <a:xfrm flipH="1">
-                      <a:off x="0" y="0"/>
-                      <a:ext cx="132563" cy="134295"/>
-                    </a:xfrm>
-                    <a:prstGeom prst="rect">
-                      <a:avLst/>
-                    </a:prstGeom>
-                  </pic:spPr>
-                </pic:pic>
-              </a:graphicData>
-            </a:graphic>
-          </wp:inline>
-        </w:drawing>
-      </mc:Fallback>
-    </mc:AlternateContent>
+    <w:pict>
+      <v:shape id="_x0000_i1060" type="#_x0000_t75" alt="A black and white logo&#10;&#10;AI-generated content may be incorrect." style="width:9.75pt;height:9.75pt;flip:x;visibility:visible;mso-wrap-style:square" o:bullet="t">
+        <v:imagedata r:id="rId2" o:title="A black and white logo&#10;&#10;AI-generated content may be incorrect"/>
+      </v:shape>
+    </w:pict>
   </w:numPicBullet>
   <w:abstractNum w:abstractNumId="0" w15:restartNumberingAfterBreak="0">
     <w:nsid w:val="084C08DD"/>
@@ -5220,10 +5398,21 @@
 </file>
 
 <file path=customXml/item2.xml><?xml version="1.0" encoding="utf-8"?>
-<b:Sources xmlns:b="http://schemas.openxmlformats.org/officeDocument/2006/bibliography" xmlns="http://schemas.openxmlformats.org/officeDocument/2006/bibliography" SelectedStyle="\APASixthEditionOfficeOnline.xsl" StyleName="APA" Version="6"/>
+<p:properties xmlns:p="http://schemas.microsoft.com/office/2006/metadata/properties" xmlns:xsi="http://www.w3.org/2001/XMLSchema-instance" xmlns:pc="http://schemas.microsoft.com/office/infopath/2007/PartnerControls">
+  <documentManagement/>
+</p:properties>
 </file>
 
 <file path=customXml/item3.xml><?xml version="1.0" encoding="utf-8"?>
+<?mso-contentType ?>
+<FormTemplates xmlns="http://schemas.microsoft.com/sharepoint/v3/contenttype/forms">
+  <Display>DocumentLibraryForm</Display>
+  <Edit>DocumentLibraryForm</Edit>
+  <New>DocumentLibraryForm</New>
+</FormTemplates>
+</file>
+
+<file path=customXml/item4.xml><?xml version="1.0" encoding="utf-8"?>
 <ct:contentTypeSchema xmlns:ct="http://schemas.microsoft.com/office/2006/metadata/contentType" xmlns:ma="http://schemas.microsoft.com/office/2006/metadata/properties/metaAttributes" ct:_="" ma:_="" ma:contentTypeName="Documento" ma:contentTypeID="0x010100E8AD719C611C944B97EA995374942C12" ma:contentTypeVersion="11" ma:contentTypeDescription="Crear nuevo documento." ma:contentTypeScope="" ma:versionID="263725433e069dab5493f0a82421ce69">
   <xsd:schema xmlns:xsd="http://www.w3.org/2001/XMLSchema" xmlns:xs="http://www.w3.org/2001/XMLSchema" xmlns:p="http://schemas.microsoft.com/office/2006/metadata/properties" xmlns:ns3="6745fe0c-ad7a-4617-a8ca-e6134a19140c" xmlns:ns4="ee60325f-ca2b-4158-9c43-9a41039b3d97" targetNamespace="http://schemas.microsoft.com/office/2006/metadata/properties" ma:root="true" ma:fieldsID="96afa8ca5a75e8fcc7887517df59cde0" ns3:_="" ns4:_="">
     <xsd:import namespace="6745fe0c-ad7a-4617-a8ca-e6134a19140c"/>
@@ -5432,19 +5621,8 @@
 </ct:contentTypeSchema>
 </file>
 
-<file path=customXml/item4.xml><?xml version="1.0" encoding="utf-8"?>
-<?mso-contentType ?>
-<FormTemplates xmlns="http://schemas.microsoft.com/sharepoint/v3/contenttype/forms">
-  <Display>DocumentLibraryForm</Display>
-  <Edit>DocumentLibraryForm</Edit>
-  <New>DocumentLibraryForm</New>
-</FormTemplates>
-</file>
-
 <file path=customXml/item5.xml><?xml version="1.0" encoding="utf-8"?>
-<p:properties xmlns:p="http://schemas.microsoft.com/office/2006/metadata/properties" xmlns:xsi="http://www.w3.org/2001/XMLSchema-instance" xmlns:pc="http://schemas.microsoft.com/office/infopath/2007/PartnerControls">
-  <documentManagement/>
-</p:properties>
+<b:Sources xmlns:b="http://schemas.openxmlformats.org/officeDocument/2006/bibliography" xmlns="http://schemas.openxmlformats.org/officeDocument/2006/bibliography" SelectedStyle="\APASixthEditionOfficeOnline.xsl" StyleName="APA" Version="6"/>
 </file>
 
 <file path=customXml/itemProps1.xml><?xml version="1.0" encoding="utf-8"?>
@@ -5456,14 +5634,23 @@
 </file>
 
 <file path=customXml/itemProps2.xml><?xml version="1.0" encoding="utf-8"?>
-<ds:datastoreItem xmlns:ds="http://schemas.openxmlformats.org/officeDocument/2006/customXml" ds:itemID="{40B7BC0D-6EAC-4652-ABF4-4BF19657B974}">
+<ds:datastoreItem xmlns:ds="http://schemas.openxmlformats.org/officeDocument/2006/customXml" ds:itemID="{D166F14D-557D-424E-9636-D42330ECA826}">
   <ds:schemaRefs>
-    <ds:schemaRef ds:uri="http://schemas.openxmlformats.org/officeDocument/2006/bibliography"/>
+    <ds:schemaRef ds:uri="http://schemas.microsoft.com/office/2006/metadata/properties"/>
+    <ds:schemaRef ds:uri="http://schemas.microsoft.com/office/infopath/2007/PartnerControls"/>
   </ds:schemaRefs>
 </ds:datastoreItem>
 </file>
 
 <file path=customXml/itemProps3.xml><?xml version="1.0" encoding="utf-8"?>
+<ds:datastoreItem xmlns:ds="http://schemas.openxmlformats.org/officeDocument/2006/customXml" ds:itemID="{AA746FB5-EEF2-4EB7-81F3-9E92166DF160}">
+  <ds:schemaRefs>
+    <ds:schemaRef ds:uri="http://schemas.microsoft.com/sharepoint/v3/contenttype/forms"/>
+  </ds:schemaRefs>
+</ds:datastoreItem>
+</file>
+
+<file path=customXml/itemProps4.xml><?xml version="1.0" encoding="utf-8"?>
 <ds:datastoreItem xmlns:ds="http://schemas.openxmlformats.org/officeDocument/2006/customXml" ds:itemID="{37A40627-DF93-40EE-99BE-E45B9B84719C}">
   <ds:schemaRefs>
     <ds:schemaRef ds:uri="http://schemas.microsoft.com/office/2006/metadata/contentType"/>
@@ -5482,19 +5669,10 @@
 </ds:datastoreItem>
 </file>
 
-<file path=customXml/itemProps4.xml><?xml version="1.0" encoding="utf-8"?>
-<ds:datastoreItem xmlns:ds="http://schemas.openxmlformats.org/officeDocument/2006/customXml" ds:itemID="{AA746FB5-EEF2-4EB7-81F3-9E92166DF160}">
+<file path=customXml/itemProps5.xml><?xml version="1.0" encoding="utf-8"?>
+<ds:datastoreItem xmlns:ds="http://schemas.openxmlformats.org/officeDocument/2006/customXml" ds:itemID="{40B7BC0D-6EAC-4652-ABF4-4BF19657B974}">
   <ds:schemaRefs>
-    <ds:schemaRef ds:uri="http://schemas.microsoft.com/sharepoint/v3/contenttype/forms"/>
-  </ds:schemaRefs>
-</ds:datastoreItem>
-</file>
-
-<file path=customXml/itemProps5.xml><?xml version="1.0" encoding="utf-8"?>
-<ds:datastoreItem xmlns:ds="http://schemas.openxmlformats.org/officeDocument/2006/customXml" ds:itemID="{D166F14D-557D-424E-9636-D42330ECA826}">
-  <ds:schemaRefs>
-    <ds:schemaRef ds:uri="http://schemas.microsoft.com/office/2006/metadata/properties"/>
-    <ds:schemaRef ds:uri="http://schemas.microsoft.com/office/infopath/2007/PartnerControls"/>
+    <ds:schemaRef ds:uri="http://schemas.openxmlformats.org/officeDocument/2006/bibliography"/>
   </ds:schemaRefs>
 </ds:datastoreItem>
 </file>

</xml_diff>